<commit_message>
chore: atualizar relatórios finais em PDF e DOCX
</commit_message>
<xml_diff>
--- a/relatorio/Relatorio_Projeto_Final.docx
+++ b/relatorio/Relatorio_Projeto_Final.docx
@@ -1576,43 +1576,38 @@
         <w:rPr>
           <w:lang w:val="pt-BR"/>
         </w:rPr>
-        <w:t xml:space="preserve"> que encadeia as etapas na ordem: ingestão, processamento/atributos, treino e avaliação do modelo, carga no </w:t>
+        <w:t xml:space="preserve"> com nove tarefas, na ordem: ingestão, processamento/atributos, treino e avaliação do modelo, carga no warehouse, build do dbt (modelos mais testes), export do dashboard, publicação da camada analítica no Postgres, provisionamento do dashboard no Metabase e upload das camadas para o S3. A última execução completou as nove tarefas com sucesso (9/9), registrada em evidencias/airflow_dag_run.log.</w:t>
       </w:r>
       <w:r>
         <w:rPr>
           <w:lang w:val="pt-BR"/>
         </w:rPr>
-        <w:t>warehouse</w:t>
       </w:r>
       <w:r>
         <w:rPr>
           <w:lang w:val="pt-BR"/>
         </w:rPr>
-        <w:t xml:space="preserve">, build do </w:t>
       </w:r>
       <w:r>
         <w:rPr>
           <w:lang w:val="pt-BR"/>
         </w:rPr>
-        <w:t>dbt</w:t>
       </w:r>
       <w:r>
         <w:rPr>
           <w:lang w:val="pt-BR"/>
         </w:rPr>
-        <w:t xml:space="preserve"> (modelos mais testes) e </w:t>
       </w:r>
       <w:r>
         <w:rPr>
           <w:lang w:val="pt-BR"/>
         </w:rPr>
-        <w:t>export</w:t>
       </w:r>
       <w:r>
         <w:rPr>
           <w:lang w:val="pt-BR"/>
         </w:rPr>
-        <w:t xml:space="preserve"> do dashboard. Para facilitar a execução local, também fornecemos um run_pipeline.py que roda exatamente a mesma sequência</w:t>
+        <w:t xml:space="preserve"> Para facilitar a execução local, também fornecemos um run_pipeline.py que roda exatamente a mesma sequência</w:t>
       </w:r>
       <w:r>
         <w:rPr>
@@ -1658,7 +1653,7 @@
         <w:jc w:val="both"/>
       </w:pPr>
       <w:r>
-        <w:t>Implementamos 10 testes de qualidade de dados no dbt (acima do mínimo de 2 pedido), incluindo not_null e unique em chaves, accepted_values em prioridade e no alvo, e um teste de relationships entre as predições e o fato de chamados. Na última execução, todos os testes passaram (PASS=22, 0 erros). A documentação dos modelos está nos arquivos .yml do projeto dbt e pode ser publicada com dbt docs.</w:t>
+        <w:t>Implementamos 10 testes de qualidade de dados no dbt (acima do mínimo de 2 pedido), incluindo not_null e unique em chaves, accepted_values em prioridade e no alvo, e um teste de relationships entre as predições e o fato de chamados. Na última execução, todos os testes passaram (PASS=22, 0 erros). A documentação dos modelos está nos arquivos .yml do projeto dbt e pode ser publicada com dbt docs. A mesma modelagem é executada em dois warehouses sem alteração de SQL — DuckDB (arquivo) e Postgres (cliente-servidor, em contêiner) —, trocando apenas o target do dbt. O Postgres é a fonte lida pelo Metabase, que não possui driver nativo para DuckDB, e essa dupla execução é a evidência prática de que a modelagem é portável para o Snowflake.</w:t>
       </w:r>
     </w:p>
     <w:p xmlns:wp14="http://schemas.microsoft.com/office/word/2010/wordml" wp14:textId="77777777">
@@ -1908,6 +1903,38 @@
         <w:jc w:val="both"/>
       </w:pPr>
     </w:p>
+    <w:p>
+      <w:pPr>
+        <w:pStyle w:val="ListBullet"/>
+      </w:pPr>
+      <w:r>
+        <w:t>três buckets S3, um por camada (raw, processed e curated), com criptografia SSE-S3 e bloqueio de acesso público;</w:t>
+      </w:r>
+    </w:p>
+    <w:p>
+      <w:pPr>
+        <w:pStyle w:val="ListBullet"/>
+      </w:pPr>
+      <w:r>
+        <w:t>um papel IAM com permissão restrita às operações de leitura e escrita nesses buckets;</w:t>
+      </w:r>
+    </w:p>
+    <w:p>
+      <w:pPr>
+        <w:pStyle w:val="ListBullet"/>
+      </w:pPr>
+      <w:r>
+        <w:t>um log group no Amazon CloudWatch para o monitoramento básico do pipeline;</w:t>
+      </w:r>
+    </w:p>
+    <w:p>
+      <w:pPr>
+        <w:pStyle w:val="ListBullet"/>
+      </w:pPr>
+      <w:r>
+        <w:t>uma função AWS Lambda de ingestão, agendada por uma regra do Amazon EventBridge.</w:t>
+      </w:r>
+    </w:p>
     <w:p xmlns:wp14="http://schemas.microsoft.com/office/word/2010/wordml" wp14:textId="251ADEF4">
       <w:pPr>
         <w:jc w:val="both"/>
@@ -1979,19 +2006,17 @@
         <w:rPr>
           <w:lang w:val="pt-BR"/>
         </w:rPr>
-        <w:t xml:space="preserve"> quando as credenciais AWS e a variável S3_BUCKET estão definidas. Validamos a lógica de upload com um S3 </w:t>
+        <w:t xml:space="preserve"> quando as credenciais AWS e a variável S3_BUCKET estão definidas. Na execução local usamos o template enxuto infra/cloudformation-s3-pipeline.yaml, que cria apenas o bucket: a cada execução o pipeline provisiona a stack via CloudFormation e envia as três camadas para o S3 — na última execução, 11 arquivos.</w:t>
       </w:r>
       <w:r>
         <w:rPr>
           <w:lang w:val="pt-BR"/>
         </w:rPr>
-        <w:t>usando uma de nossas contas</w:t>
       </w:r>
       <w:r>
         <w:rPr>
           <w:lang w:val="pt-BR"/>
         </w:rPr>
-        <w:t>, confirmando o envio das três camadas.</w:t>
       </w:r>
     </w:p>
     <w:p xmlns:wp14="http://schemas.microsoft.com/office/word/2010/wordml" wp14:textId="516C72B5">
@@ -3572,7 +3597,7 @@
         <w:jc w:val="both"/>
       </w:pPr>
       <w:r>
-        <w:t>O dashboard foi construído no Metabase sobre as tabelas do schema analytics. Ele reúne os indicadores principais (volume de chamados, taxa de violação de SLA, tempo médio de resolução e CSAT), a visualização dos dados tratados (violação por prioridade, categoria, canal e mês), os resultados do modelo (matriz de confusão e distribuição de risco) e uma fila priorizada pelos chamados de maior risco. Há filtros por prioridade, categoria, canal e mês.</w:t>
+        <w:t>O dashboard foi construído no Metabase sobre as tabelas do schema analytics. Ele reúne os indicadores principais (volume de chamados, taxa de violação de SLA, tempo médio de resolução e CSAT), a visualização dos dados tratados (violação por prioridade, categoria, canal e mês), os resultados do modelo (matriz de confusão e distribuição de risco) e uma fila priorizada pelos chamados de maior risco. O painel tem três filtros — prioridade, categoria e canal — ligados às colunas reais das tabelas (field filters), e não a texto livre. Eles recortam o painel inteiro: aplicando Prioridade = Crítica, por exemplo, a taxa de violação de SLA sai de 22,8% para 60,4%. O painel é provisionado por script, via API do Metabase, junto com o pipeline.</w:t>
       </w:r>
     </w:p>
     <w:p xmlns:wp14="http://schemas.microsoft.com/office/word/2010/wordml" wp14:textId="77777777">
@@ -3582,7 +3607,7 @@
       <w:r>
         <w:drawing>
           <wp:inline xmlns:a="http://schemas.openxmlformats.org/drawingml/2006/main" xmlns:pic="http://schemas.openxmlformats.org/drawingml/2006/picture" xmlns:wp14="http://schemas.microsoft.com/office/word/2010/wordprocessingDrawing" wp14:anchorId="4064160C" wp14:editId="7777777">
-            <wp:extent cx="6035040" cy="4499068"/>
+            <wp:extent cx="5724000" cy="4223843"/>
             <wp:docPr id="4" name="Picture 4"/>
             <wp:cNvGraphicFramePr>
               <a:graphicFrameLocks noChangeAspect="1"/>
@@ -3603,7 +3628,7 @@
                   <pic:spPr>
                     <a:xfrm>
                       <a:off x="0" y="0"/>
-                      <a:ext cx="6035040" cy="4499068"/>
+                      <a:ext cx="5724000" cy="4223843"/>
                     </a:xfrm>
                     <a:prstGeom prst="rect"/>
                   </pic:spPr>
@@ -3624,7 +3649,54 @@
           <w:color w:val="555555"/>
           <w:sz w:val="18"/>
         </w:rPr>
-        <w:t>Figura 3. Painel de apoio à decisão (visão consolidada).</w:t>
+        <w:t>Figura 3a. Painel no Metabase: indicadores e violação de SLA por prioridade, categoria, canal e mês.</w:t>
+      </w:r>
+    </w:p>
+    <w:p>
+      <w:pPr>
+        <w:jc w:val="center"/>
+      </w:pPr>
+      <w:r>
+        <w:drawing>
+          <wp:inline>
+            <wp:extent cx="5724000" cy="3457807"/>
+            <wp:docPr id="545828973" name="Picture 545828973"/>
+            <wp:cNvGraphicFramePr>
+              <a:graphicFrameLocks noChangeAspect="1"/>
+            </wp:cNvGraphicFramePr>
+            <a:graphic>
+              <a:graphicData uri="http://schemas.openxmlformats.org/drawingml/2006/picture">
+                <pic:pic>
+                  <pic:nvPicPr>
+                    <pic:cNvPr id="0" name="meia_base.png"/>
+                    <pic:cNvPicPr/>
+                  </pic:nvPicPr>
+                  <pic:blipFill>
+                    <a:blip r:embed="rId9"/>
+                    <a:stretch>
+                      <a:fillRect/>
+                    </a:stretch>
+                  </pic:blipFill>
+                  <pic:spPr>
+                    <a:xfrm>
+                      <a:off x="0" y="0"/>
+                      <a:ext cx="5724000" cy="3457807"/>
+                    </a:xfrm>
+                    <a:prstGeom prst="rect"/>
+                  </pic:spPr>
+                </pic:pic>
+              </a:graphicData>
+            </a:graphic>
+          </wp:inline>
+        </w:drawing>
+      </w:r>
+    </w:p>
+    <w:p>
+      <w:pPr>
+        <w:jc w:val="center"/>
+      </w:pPr>
+      <w:r>
+        <w:t>Figura 3b. Painel no Metabase: fila priorizada por risco previsto, distribuição da fila por faixa de risco e matriz de confusão do modelo.</w:t>
       </w:r>
     </w:p>
     <w:p xmlns:wp14="http://schemas.microsoft.com/office/word/2010/wordml" wp14:textId="77777777">
@@ -3759,43 +3831,38 @@
         <w:rPr>
           <w:lang w:val="pt-BR"/>
         </w:rPr>
-        <w:t xml:space="preserve">, o </w:t>
+        <w:t>, o dbt possui profiles para DuckDB, Postgres e Snowflake, e a orquestração roda em uma DAG de Airflow em contêiner, com execução registrada de nove tarefas em nove.</w:t>
       </w:r>
       <w:r>
         <w:rPr>
           <w:lang w:val="pt-BR"/>
         </w:rPr>
-        <w:t>dbt</w:t>
       </w:r>
       <w:r>
         <w:rPr>
           <w:lang w:val="pt-BR"/>
         </w:rPr>
-        <w:t xml:space="preserve"> possui profile para </w:t>
       </w:r>
       <w:r>
         <w:rPr>
           <w:lang w:val="pt-BR"/>
         </w:rPr>
-        <w:t>Snowflake</w:t>
       </w:r>
       <w:r>
         <w:rPr>
           <w:lang w:val="pt-BR"/>
         </w:rPr>
-        <w:t xml:space="preserve"> e a orquestração tem uma DAG de </w:t>
       </w:r>
       <w:r>
         <w:rPr>
           <w:lang w:val="pt-BR"/>
         </w:rPr>
-        <w:t>Airflow</w:t>
       </w:r>
       <w:r>
         <w:rPr>
           <w:lang w:val="pt-BR"/>
         </w:rPr>
-        <w:t xml:space="preserve">. Como </w:t>
+        <w:t xml:space="preserve"> Como </w:t>
       </w:r>
       <w:r>
         <w:rPr>

</xml_diff>